<commit_message>
Add interactive chat host, Gradio demo, and date-dispute flow.
Introduce InteractiveChatEngine with hook computations, dispute correction branches, and host-owned prompting so users get one tree question per step and embedded dates update session state without redundant asks.

Co-authored-by: Cursor <cursoragent@cursor.com>
</commit_message>
<xml_diff>
--- a/Tree-Structures.docx
+++ b/Tree-Structures.docx
@@ -1,16 +1,24 @@
 
 <file path=word/document.xml><?xml version="1.0" encoding="utf-8"?>
-<w:document xmlns:mc="http://schemas.openxmlformats.org/markup-compatibility/2006" xmlns:o="urn:schemas-microsoft-com:office:office" xmlns:r="http://schemas.openxmlformats.org/officeDocument/2006/relationships" xmlns:m="http://schemas.openxmlformats.org/officeDocument/2006/math" xmlns:v="urn:schemas-microsoft-com:vml" xmlns:wp="http://schemas.openxmlformats.org/drawingml/2006/wordprocessingDrawing" xmlns:w10="urn:schemas-microsoft-com:office:word" xmlns:w="http://schemas.openxmlformats.org/wordprocessingml/2006/main" xmlns:wne="http://schemas.microsoft.com/office/word/2006/wordml" xmlns:sl="http://schemas.openxmlformats.org/schemaLibrary/2006/main" xmlns:a="http://schemas.openxmlformats.org/drawingml/2006/main" xmlns:pic="http://schemas.openxmlformats.org/drawingml/2006/picture" xmlns:c="http://schemas.openxmlformats.org/drawingml/2006/chart" xmlns:lc="http://schemas.openxmlformats.org/drawingml/2006/lockedCanvas" xmlns:dgm="http://schemas.openxmlformats.org/drawingml/2006/diagram" xmlns:wps="http://schemas.microsoft.com/office/word/2010/wordprocessingShape" xmlns:wpg="http://schemas.microsoft.com/office/word/2010/wordprocessingGroup" xmlns:w14="http://schemas.microsoft.com/office/word/2010/wordml" xmlns:w15="http://schemas.microsoft.com/office/word/2012/wordml" xmlns:w16="http://schemas.microsoft.com/office/word/2018/wordml" xmlns:w16cex="http://schemas.microsoft.com/office/word/2018/wordml/cex" xmlns:w16cid="http://schemas.microsoft.com/office/word/2016/wordml/cid" xmlns="http://schemas.microsoft.com/office/tasks/2019/documenttasks" xmlns:cr="http://schemas.microsoft.com/office/comments/2020/reactions">
+<w:document xmlns:wpc="http://schemas.microsoft.com/office/word/2010/wordprocessingCanvas" xmlns:cx="http://schemas.microsoft.com/office/drawing/2014/chartex" xmlns:cx1="http://schemas.microsoft.com/office/drawing/2015/9/8/chartex" xmlns:cx2="http://schemas.microsoft.com/office/drawing/2015/10/21/chartex" xmlns:cx3="http://schemas.microsoft.com/office/drawing/2016/5/9/chartex" xmlns:cx4="http://schemas.microsoft.com/office/drawing/2016/5/10/chartex" xmlns:cx5="http://schemas.microsoft.com/office/drawing/2016/5/11/chartex" xmlns:cx6="http://schemas.microsoft.com/office/drawing/2016/5/12/chartex" xmlns:cx7="http://schemas.microsoft.com/office/drawing/2016/5/13/chartex" xmlns:cx8="http://schemas.microsoft.com/office/drawing/2016/5/14/chartex" xmlns:mc="http://schemas.openxmlformats.org/markup-compatibility/2006" xmlns:aink="http://schemas.microsoft.com/office/drawing/2016/ink" xmlns:am3d="http://schemas.microsoft.com/office/drawing/2017/model3d" xmlns:o="urn:schemas-microsoft-com:office:office" xmlns:oel="http://schemas.microsoft.com/office/2019/extlst" xmlns:r="http://schemas.openxmlformats.org/officeDocument/2006/relationships" xmlns:m="http://schemas.openxmlformats.org/officeDocument/2006/math" xmlns:v="urn:schemas-microsoft-com:vml" xmlns:wp14="http://schemas.microsoft.com/office/word/2010/wordprocessingDrawing" xmlns:wp="http://schemas.openxmlformats.org/drawingml/2006/wordprocessingDrawing" xmlns:w10="urn:schemas-microsoft-com:office:word" xmlns:w="http://schemas.openxmlformats.org/wordprocessingml/2006/main" xmlns:w14="http://schemas.microsoft.com/office/word/2010/wordml" xmlns:w15="http://schemas.microsoft.com/office/word/2012/wordml" xmlns:w16cex="http://schemas.microsoft.com/office/word/2018/wordml/cex" xmlns:w16cid="http://schemas.microsoft.com/office/word/2016/wordml/cid" xmlns:w16="http://schemas.microsoft.com/office/word/2018/wordml" xmlns:w16du="http://schemas.microsoft.com/office/word/2023/wordml/word16du" xmlns:w16sdtdh="http://schemas.microsoft.com/office/word/2020/wordml/sdtdatahash" xmlns:w16sdtfl="http://schemas.microsoft.com/office/word/2024/wordml/sdtformatlock" xmlns:w16se="http://schemas.microsoft.com/office/word/2015/wordml/symex" xmlns:wpg="http://schemas.microsoft.com/office/word/2010/wordprocessingGroup" xmlns:wpi="http://schemas.microsoft.com/office/word/2010/wordprocessingInk" xmlns:wne="http://schemas.microsoft.com/office/word/2006/wordml" xmlns:wps="http://schemas.microsoft.com/office/word/2010/wordprocessingShape" mc:Ignorable="w14 w15 w16se w16cid w16 w16cex w16sdtdh w16sdtfl w16du wp14">
   <w:body>
     <w:p>
-      <w:pPr>
-        <w:rPr/>
-      </w:pPr>
-      <w:r>
-        <w:rPr>
-          <w:rtl w:val="0"/>
-        </w:rPr>
-        <w:t xml:space="preserve">Statute of Limitations</w:t>
+      <w:r>
+        <w:t xml:space="preserve">TODO: add branches for double checking complaint filing/compliant payment dates. Also create fields to save into a </w:t>
+      </w:r>
+      <w:proofErr w:type="spellStart"/>
+      <w:r>
+        <w:t>dataframe</w:t>
+      </w:r>
+      <w:proofErr w:type="spellEnd"/>
+      <w:r>
+        <w:t xml:space="preserve"> (including percentages). Also create “unsure” branches.</w:t>
+      </w:r>
+    </w:p>
+    <w:p/>
+    <w:p>
+      <w:r>
+        <w:t>Statute of Limitations</w:t>
       </w:r>
     </w:p>
     <w:p>
@@ -19,16 +27,69 @@
           <w:ilvl w:val="0"/>
           <w:numId w:val="1"/>
         </w:numPr>
-        <w:ind w:left="720" w:hanging="360"/>
-        <w:rPr>
-          <w:u w:val="none"/>
-        </w:rPr>
-      </w:pPr>
-      <w:r>
-        <w:rPr>
-          <w:rtl w:val="0"/>
-        </w:rPr>
-        <w:t xml:space="preserve">Is the filing date of the complaint [filing_date_per_complaint]?</w:t>
+      </w:pPr>
+      <w:r>
+        <w:t>Is the filing date of the complaint [</w:t>
+      </w:r>
+      <w:proofErr w:type="spellStart"/>
+      <w:r>
+        <w:t>filing_date_per_complaint</w:t>
+      </w:r>
+      <w:proofErr w:type="spellEnd"/>
+      <w:r>
+        <w:t>]?</w:t>
+      </w:r>
+    </w:p>
+    <w:p>
+      <w:pPr>
+        <w:numPr>
+          <w:ilvl w:val="1"/>
+          <w:numId w:val="1"/>
+        </w:numPr>
+      </w:pPr>
+      <w:r>
+        <w:t>Yes: next question</w:t>
+      </w:r>
+    </w:p>
+    <w:p>
+      <w:pPr>
+        <w:numPr>
+          <w:ilvl w:val="1"/>
+          <w:numId w:val="1"/>
+        </w:numPr>
+      </w:pPr>
+      <w:r>
+        <w:t xml:space="preserve">No: </w:t>
+      </w:r>
+      <w:r>
+        <w:t>are you possibly looking at a different complaint? If not, then what is the correct filing date?</w:t>
+      </w:r>
+    </w:p>
+    <w:p>
+      <w:pPr>
+        <w:numPr>
+          <w:ilvl w:val="2"/>
+          <w:numId w:val="1"/>
+        </w:numPr>
+      </w:pPr>
+      <w:r>
+        <w:t>Update [</w:t>
+      </w:r>
+      <w:proofErr w:type="spellStart"/>
+      <w:r>
+        <w:t>filing_date_per_complaint</w:t>
+      </w:r>
+      <w:proofErr w:type="spellEnd"/>
+      <w:r>
+        <w:t>], switch [</w:t>
+      </w:r>
+      <w:proofErr w:type="spellStart"/>
+      <w:r>
+        <w:t>filing_date_changed</w:t>
+      </w:r>
+      <w:proofErr w:type="spellEnd"/>
+      <w:r>
+        <w:t>] to True.</w:t>
       </w:r>
     </w:p>
     <w:p>
@@ -37,16 +98,69 @@
           <w:ilvl w:val="0"/>
           <w:numId w:val="1"/>
         </w:numPr>
-        <w:ind w:left="720" w:hanging="360"/>
-        <w:rPr>
-          <w:u w:val="none"/>
-        </w:rPr>
-      </w:pPr>
-      <w:r>
-        <w:rPr>
-          <w:rtl w:val="0"/>
-        </w:rPr>
-        <w:t xml:space="preserve">Is the last time you made a compliant payment to the original creditor [last_payment_date_per_complaint]?</w:t>
+      </w:pPr>
+      <w:r>
+        <w:t>Is the last time you made a compliant payment to the original creditor [</w:t>
+      </w:r>
+      <w:proofErr w:type="spellStart"/>
+      <w:r>
+        <w:t>last_payment_date_per_complaint</w:t>
+      </w:r>
+      <w:proofErr w:type="spellEnd"/>
+      <w:r>
+        <w:t>]?</w:t>
+      </w:r>
+    </w:p>
+    <w:p>
+      <w:pPr>
+        <w:numPr>
+          <w:ilvl w:val="1"/>
+          <w:numId w:val="1"/>
+        </w:numPr>
+      </w:pPr>
+      <w:r>
+        <w:t>Yes: next question</w:t>
+      </w:r>
+    </w:p>
+    <w:p>
+      <w:pPr>
+        <w:numPr>
+          <w:ilvl w:val="1"/>
+          <w:numId w:val="1"/>
+        </w:numPr>
+      </w:pPr>
+      <w:r>
+        <w:t>No: are you possibly looking at a different complaint? If not, then what is the correct filing date?</w:t>
+      </w:r>
+    </w:p>
+    <w:p>
+      <w:pPr>
+        <w:numPr>
+          <w:ilvl w:val="2"/>
+          <w:numId w:val="1"/>
+        </w:numPr>
+      </w:pPr>
+      <w:r>
+        <w:t>Update [</w:t>
+      </w:r>
+      <w:proofErr w:type="spellStart"/>
+      <w:r>
+        <w:t>last_payment_date_per_complaint</w:t>
+      </w:r>
+      <w:proofErr w:type="spellEnd"/>
+      <w:r>
+        <w:t>]</w:t>
+      </w:r>
+      <w:r>
+        <w:t>, switch [</w:t>
+      </w:r>
+      <w:proofErr w:type="spellStart"/>
+      <w:r>
+        <w:t>last_payment_date_changed</w:t>
+      </w:r>
+      <w:proofErr w:type="spellEnd"/>
+      <w:r>
+        <w:t>] to True.</w:t>
       </w:r>
     </w:p>
     <w:p>
@@ -55,16 +169,9 @@
           <w:ilvl w:val="0"/>
           <w:numId w:val="1"/>
         </w:numPr>
-        <w:ind w:left="720" w:hanging="360"/>
-        <w:rPr>
-          <w:u w:val="none"/>
-        </w:rPr>
-      </w:pPr>
-      <w:r>
-        <w:rPr>
-          <w:rtl w:val="0"/>
-        </w:rPr>
-        <w:t xml:space="preserve">Did you make additional payments afterwards to the original creditor?</w:t>
+      </w:pPr>
+      <w:r>
+        <w:t>Did you make additional payments afterwards to the original creditor?</w:t>
       </w:r>
     </w:p>
     <w:p>
@@ -73,16 +180,9 @@
           <w:ilvl w:val="1"/>
           <w:numId w:val="1"/>
         </w:numPr>
-        <w:ind w:left="1440" w:hanging="360"/>
-        <w:rPr>
-          <w:u w:val="none"/>
-        </w:rPr>
-      </w:pPr>
-      <w:r>
-        <w:rPr>
-          <w:rtl w:val="0"/>
-        </w:rPr>
-        <w:t xml:space="preserve">Yes: when did you make the last additional payment?</w:t>
+      </w:pPr>
+      <w:r>
+        <w:t>Yes: when did you make the last additional payment?</w:t>
       </w:r>
     </w:p>
     <w:p>
@@ -91,16 +191,17 @@
           <w:ilvl w:val="2"/>
           <w:numId w:val="1"/>
         </w:numPr>
-        <w:ind w:left="2160" w:hanging="360"/>
-        <w:rPr>
-          <w:u w:val="none"/>
-        </w:rPr>
-      </w:pPr>
-      <w:r>
-        <w:rPr>
-          <w:rtl w:val="0"/>
-        </w:rPr>
-        <w:t xml:space="preserve">[last_payment_date_OG_creditor]</w:t>
+      </w:pPr>
+      <w:r>
+        <w:t>[</w:t>
+      </w:r>
+      <w:proofErr w:type="spellStart"/>
+      <w:r>
+        <w:t>last_payment_date_OG_creditor</w:t>
+      </w:r>
+      <w:proofErr w:type="spellEnd"/>
+      <w:r>
+        <w:t>]</w:t>
       </w:r>
     </w:p>
     <w:p>
@@ -109,16 +210,9 @@
           <w:ilvl w:val="1"/>
           <w:numId w:val="1"/>
         </w:numPr>
-        <w:ind w:left="1440" w:hanging="360"/>
-        <w:rPr>
-          <w:u w:val="none"/>
-        </w:rPr>
-      </w:pPr>
-      <w:r>
-        <w:rPr>
-          <w:rtl w:val="0"/>
-        </w:rPr>
-        <w:t xml:space="preserve">No: next question</w:t>
+      </w:pPr>
+      <w:r>
+        <w:t>No: next question</w:t>
       </w:r>
     </w:p>
     <w:p>
@@ -127,16 +221,9 @@
           <w:ilvl w:val="0"/>
           <w:numId w:val="1"/>
         </w:numPr>
-        <w:ind w:left="720" w:hanging="360"/>
-        <w:rPr>
-          <w:u w:val="none"/>
-        </w:rPr>
-      </w:pPr>
-      <w:r>
-        <w:rPr>
-          <w:rtl w:val="0"/>
-        </w:rPr>
-        <w:t xml:space="preserve">Did you make additional payments afterwards to the debt collector?</w:t>
+      </w:pPr>
+      <w:r>
+        <w:t>Did you make additional payments afterwards to the debt collector?</w:t>
       </w:r>
     </w:p>
     <w:p>
@@ -145,16 +232,9 @@
           <w:ilvl w:val="1"/>
           <w:numId w:val="1"/>
         </w:numPr>
-        <w:ind w:left="1440" w:hanging="360"/>
-        <w:rPr>
-          <w:u w:val="none"/>
-        </w:rPr>
-      </w:pPr>
-      <w:r>
-        <w:rPr>
-          <w:rtl w:val="0"/>
-        </w:rPr>
-        <w:t xml:space="preserve">Yes: when did you make the last additional payment?</w:t>
+      </w:pPr>
+      <w:r>
+        <w:t>Yes: when did you make the last additional payment?</w:t>
       </w:r>
     </w:p>
     <w:p>
@@ -163,16 +243,17 @@
           <w:ilvl w:val="2"/>
           <w:numId w:val="1"/>
         </w:numPr>
-        <w:ind w:left="2160" w:hanging="360"/>
-        <w:rPr>
-          <w:u w:val="none"/>
-        </w:rPr>
-      </w:pPr>
-      <w:r>
-        <w:rPr>
-          <w:rtl w:val="0"/>
-        </w:rPr>
-        <w:t xml:space="preserve">[last_payment_date_debt_collector]</w:t>
+      </w:pPr>
+      <w:r>
+        <w:t>[</w:t>
+      </w:r>
+      <w:proofErr w:type="spellStart"/>
+      <w:r>
+        <w:t>last_payment_date_debt_collector</w:t>
+      </w:r>
+      <w:proofErr w:type="spellEnd"/>
+      <w:r>
+        <w:t>]</w:t>
       </w:r>
     </w:p>
     <w:p>
@@ -181,16 +262,9 @@
           <w:ilvl w:val="1"/>
           <w:numId w:val="1"/>
         </w:numPr>
-        <w:ind w:left="1440" w:hanging="360"/>
-        <w:rPr>
-          <w:u w:val="none"/>
-        </w:rPr>
-      </w:pPr>
-      <w:r>
-        <w:rPr>
-          <w:rtl w:val="0"/>
-        </w:rPr>
-        <w:t xml:space="preserve">No: next question</w:t>
+      </w:pPr>
+      <w:r>
+        <w:t>No: next question</w:t>
       </w:r>
     </w:p>
     <w:p>
@@ -199,16 +273,17 @@
           <w:ilvl w:val="0"/>
           <w:numId w:val="1"/>
         </w:numPr>
-        <w:ind w:left="720" w:hanging="360"/>
-        <w:rPr>
-          <w:u w:val="none"/>
-        </w:rPr>
-      </w:pPr>
-      <w:r>
-        <w:rPr>
-          <w:rtl w:val="0"/>
-        </w:rPr>
-        <w:t xml:space="preserve">Computation: Take the most recent payment date out of: the last payment date per the complaint, the last payment date to the original creditor, and the last payment date to the debt collector. Is the filing date minus the date of the last payment made more than 3 years?</w:t>
+      </w:pPr>
+      <w:r>
+        <w:t xml:space="preserve">Computation: Take the most recent payment date out </w:t>
+      </w:r>
+      <w:proofErr w:type="gramStart"/>
+      <w:r>
+        <w:t>of:</w:t>
+      </w:r>
+      <w:proofErr w:type="gramEnd"/>
+      <w:r>
+        <w:t xml:space="preserve"> the last payment date per the complaint, the last payment date to the original creditor, and the last payment date to the debt collector. Is the filing date minus the date of the last payment made more than 3 years?</w:t>
       </w:r>
     </w:p>
     <w:p>
@@ -217,16 +292,9 @@
           <w:ilvl w:val="1"/>
           <w:numId w:val="1"/>
         </w:numPr>
-        <w:ind w:left="1440" w:hanging="360"/>
-        <w:rPr>
-          <w:u w:val="none"/>
-        </w:rPr>
-      </w:pPr>
-      <w:r>
-        <w:rPr>
-          <w:rtl w:val="0"/>
-        </w:rPr>
-        <w:t xml:space="preserve">If yes, SOL is an affirmative defense.</w:t>
+      </w:pPr>
+      <w:r>
+        <w:t>If yes, SOL is an affirmative defense.</w:t>
       </w:r>
     </w:p>
     <w:p>
@@ -235,47 +303,16 @@
           <w:ilvl w:val="1"/>
           <w:numId w:val="1"/>
         </w:numPr>
-        <w:ind w:left="1440" w:hanging="360"/>
-        <w:rPr>
-          <w:u w:val="none"/>
-        </w:rPr>
-      </w:pPr>
-      <w:r>
-        <w:rPr>
-          <w:rtl w:val="0"/>
-        </w:rPr>
-        <w:t xml:space="preserve">If no, SOL is not an affirmative defense.</w:t>
-      </w:r>
-    </w:p>
-    <w:p>
-      <w:pPr>
-        <w:rPr/>
-      </w:pPr>
-      <w:r>
-        <w:rPr>
-          <w:rtl w:val="0"/>
-        </w:rPr>
-      </w:r>
-    </w:p>
-    <w:p>
-      <w:pPr>
-        <w:rPr/>
-      </w:pPr>
-      <w:r>
-        <w:rPr>
-          <w:rtl w:val="0"/>
-        </w:rPr>
-      </w:r>
-    </w:p>
-    <w:p>
-      <w:pPr>
-        <w:rPr/>
-      </w:pPr>
-      <w:r>
-        <w:rPr>
-          <w:rtl w:val="0"/>
-        </w:rPr>
-        <w:t xml:space="preserve">FDCPA</w:t>
+      </w:pPr>
+      <w:r>
+        <w:t>If no, SOL is not an affirmative defense.</w:t>
+      </w:r>
+    </w:p>
+    <w:p/>
+    <w:p/>
+    <w:p>
+      <w:r>
+        <w:t>FDCPA</w:t>
       </w:r>
     </w:p>
     <w:p>
@@ -284,16 +321,9 @@
           <w:ilvl w:val="0"/>
           <w:numId w:val="2"/>
         </w:numPr>
-        <w:ind w:left="720" w:hanging="360"/>
-        <w:rPr>
-          <w:u w:val="none"/>
-        </w:rPr>
-      </w:pPr>
-      <w:r>
-        <w:rPr>
-          <w:rtl w:val="0"/>
-        </w:rPr>
-        <w:t xml:space="preserve">Did the debt collector threaten that you could be arrested for not paying your debt?</w:t>
+      </w:pPr>
+      <w:r>
+        <w:t>Did the debt collector threaten that you could be arrested for not paying your debt?</w:t>
       </w:r>
     </w:p>
     <w:p>
@@ -302,16 +332,9 @@
           <w:ilvl w:val="1"/>
           <w:numId w:val="2"/>
         </w:numPr>
-        <w:ind w:left="1440" w:hanging="360"/>
-        <w:rPr>
-          <w:u w:val="none"/>
-        </w:rPr>
-      </w:pPr>
-      <w:r>
-        <w:rPr>
-          <w:rtl w:val="0"/>
-        </w:rPr>
-        <w:t xml:space="preserve">Yes: [threatened]</w:t>
+      </w:pPr>
+      <w:r>
+        <w:t>Yes: [threatened]</w:t>
       </w:r>
     </w:p>
     <w:p>
@@ -320,16 +343,9 @@
           <w:ilvl w:val="1"/>
           <w:numId w:val="2"/>
         </w:numPr>
-        <w:ind w:left="1440" w:hanging="360"/>
-        <w:rPr>
-          <w:u w:val="none"/>
-        </w:rPr>
-      </w:pPr>
-      <w:r>
-        <w:rPr>
-          <w:rtl w:val="0"/>
-        </w:rPr>
-        <w:t xml:space="preserve">No: next question</w:t>
+      </w:pPr>
+      <w:r>
+        <w:t>No: next question</w:t>
       </w:r>
     </w:p>
     <w:p>
@@ -338,16 +354,9 @@
           <w:ilvl w:val="0"/>
           <w:numId w:val="2"/>
         </w:numPr>
-        <w:ind w:left="720" w:hanging="360"/>
-        <w:rPr>
-          <w:u w:val="none"/>
-        </w:rPr>
-      </w:pPr>
-      <w:r>
-        <w:rPr>
-          <w:rtl w:val="0"/>
-        </w:rPr>
-        <w:t xml:space="preserve">Did the debt collector disclose your debt to third parties like your family or friends without your permission?</w:t>
+      </w:pPr>
+      <w:r>
+        <w:t>Did the debt collector disclose your debt to third parties like your family or friends without your permission?</w:t>
       </w:r>
     </w:p>
     <w:p>
@@ -356,16 +365,9 @@
           <w:ilvl w:val="1"/>
           <w:numId w:val="2"/>
         </w:numPr>
-        <w:ind w:left="1440" w:hanging="360"/>
-        <w:rPr>
-          <w:u w:val="none"/>
-        </w:rPr>
-      </w:pPr>
-      <w:r>
-        <w:rPr>
-          <w:rtl w:val="0"/>
-        </w:rPr>
-        <w:t xml:space="preserve">Yes: [disclosed]</w:t>
+      </w:pPr>
+      <w:r>
+        <w:t>Yes: [disclosed]</w:t>
       </w:r>
     </w:p>
     <w:p>
@@ -374,16 +376,9 @@
           <w:ilvl w:val="1"/>
           <w:numId w:val="2"/>
         </w:numPr>
-        <w:ind w:left="1440" w:hanging="360"/>
-        <w:rPr>
-          <w:u w:val="none"/>
-        </w:rPr>
-      </w:pPr>
-      <w:r>
-        <w:rPr>
-          <w:rtl w:val="0"/>
-        </w:rPr>
-        <w:t xml:space="preserve">No: next question</w:t>
+      </w:pPr>
+      <w:r>
+        <w:t>No: next question</w:t>
       </w:r>
     </w:p>
     <w:p>
@@ -392,16 +387,9 @@
           <w:ilvl w:val="0"/>
           <w:numId w:val="2"/>
         </w:numPr>
-        <w:ind w:left="720" w:hanging="360"/>
-        <w:rPr>
-          <w:u w:val="none"/>
-        </w:rPr>
-      </w:pPr>
-      <w:r>
-        <w:rPr>
-          <w:rtl w:val="0"/>
-        </w:rPr>
-        <w:t xml:space="preserve">If [threatened] or [disclosed]: do you have written or recorded evidence of the debt collector’s bad behavior?</w:t>
+      </w:pPr>
+      <w:r>
+        <w:t>If [threatened] or [disclosed]: do you have written or recorded evidence of the debt collector’s bad behavior?</w:t>
       </w:r>
     </w:p>
     <w:p>
@@ -410,16 +398,9 @@
           <w:ilvl w:val="1"/>
           <w:numId w:val="2"/>
         </w:numPr>
-        <w:ind w:left="1440" w:hanging="360"/>
-        <w:rPr>
-          <w:u w:val="none"/>
-        </w:rPr>
-      </w:pPr>
-      <w:r>
-        <w:rPr>
-          <w:rtl w:val="0"/>
-        </w:rPr>
-        <w:t xml:space="preserve">Yes: [evidence]</w:t>
+      </w:pPr>
+      <w:r>
+        <w:t>Yes: [evidence]</w:t>
       </w:r>
     </w:p>
     <w:p>
@@ -428,16 +409,9 @@
           <w:ilvl w:val="1"/>
           <w:numId w:val="2"/>
         </w:numPr>
-        <w:ind w:left="1440" w:hanging="360"/>
-        <w:rPr>
-          <w:u w:val="none"/>
-        </w:rPr>
-      </w:pPr>
-      <w:r>
-        <w:rPr>
-          <w:rtl w:val="0"/>
-        </w:rPr>
-        <w:t xml:space="preserve">No: next question</w:t>
+      </w:pPr>
+      <w:r>
+        <w:t>No: next question</w:t>
       </w:r>
     </w:p>
     <w:p>
@@ -446,30 +420,36 @@
           <w:ilvl w:val="0"/>
           <w:numId w:val="2"/>
         </w:numPr>
-        <w:ind w:left="720" w:hanging="360"/>
-        <w:rPr>
-          <w:u w:val="none"/>
-        </w:rPr>
-      </w:pPr>
-      <w:r>
-        <w:rPr>
-          <w:rtl w:val="0"/>
-        </w:rPr>
-        <w:t xml:space="preserve">Computation: If [threatened] or [disclosed] with [evidence], FDCPA violation is an affirmative defense. If no [evidence] but [threatened] or [disclosed], FDCPA violation is a potential affirmative defense. If none, then not an affirmative defense.</w:t>
+      </w:pPr>
+      <w:r>
+        <w:lastRenderedPageBreak/>
+        <w:t xml:space="preserve">Computation: If [threatened] or [disclosed] with [evidence], FDCPA violation is an affirmative defense. If </w:t>
+      </w:r>
+      <w:proofErr w:type="gramStart"/>
+      <w:r>
+        <w:t>no</w:t>
+      </w:r>
+      <w:proofErr w:type="gramEnd"/>
+      <w:r>
+        <w:t xml:space="preserve"> [evidence] but [threatened] or [disclosed], FDCPA violation is a potential affirmative defense. If none, then not an affirmative defense.</w:t>
       </w:r>
     </w:p>
     <w:sectPr>
-      <w:pgSz w:h="15840" w:w="12240" w:orient="portrait"/>
-      <w:pgMar w:bottom="1440" w:top="1440" w:left="1440" w:right="1440" w:header="720" w:footer="720"/>
+      <w:pgSz w:w="12240" w:h="15840"/>
+      <w:pgMar w:top="1440" w:right="1440" w:bottom="1440" w:left="1440" w:header="720" w:footer="720" w:gutter="0"/>
       <w:pgNumType w:start="1"/>
+      <w:cols w:space="720"/>
     </w:sectPr>
   </w:body>
 </w:document>
 </file>
 
 <file path=word/numbering.xml><?xml version="1.0" encoding="utf-8"?>
-<w:numbering xmlns:mc="http://schemas.openxmlformats.org/markup-compatibility/2006" xmlns:o="urn:schemas-microsoft-com:office:office" xmlns:r="http://schemas.openxmlformats.org/officeDocument/2006/relationships" xmlns:m="http://schemas.openxmlformats.org/officeDocument/2006/math" xmlns:v="urn:schemas-microsoft-com:vml" xmlns:wp="http://schemas.openxmlformats.org/drawingml/2006/wordprocessingDrawing" xmlns:w10="urn:schemas-microsoft-com:office:word" xmlns:w="http://schemas.openxmlformats.org/wordprocessingml/2006/main" xmlns:wne="http://schemas.microsoft.com/office/word/2006/wordml" xmlns:sl="http://schemas.openxmlformats.org/schemaLibrary/2006/main" xmlns:a="http://schemas.openxmlformats.org/drawingml/2006/main" xmlns:pic="http://schemas.openxmlformats.org/drawingml/2006/picture" xmlns:c="http://schemas.openxmlformats.org/drawingml/2006/chart" xmlns:lc="http://schemas.openxmlformats.org/drawingml/2006/lockedCanvas" xmlns:dgm="http://schemas.openxmlformats.org/drawingml/2006/diagram" xmlns:wps="http://schemas.microsoft.com/office/word/2010/wordprocessingShape" xmlns:wpg="http://schemas.microsoft.com/office/word/2010/wordprocessingGroup" xmlns:w14="http://schemas.microsoft.com/office/word/2010/wordml" xmlns:w15="http://schemas.microsoft.com/office/word/2012/wordml" xmlns:w16="http://schemas.microsoft.com/office/word/2018/wordml" xmlns:w16cex="http://schemas.microsoft.com/office/word/2018/wordml/cex" xmlns:w16cid="http://schemas.microsoft.com/office/word/2016/wordml/cid" xmlns="http://schemas.microsoft.com/office/tasks/2019/documenttasks" xmlns:cr="http://schemas.microsoft.com/office/comments/2020/reactions">
-  <w:abstractNum w:abstractNumId="1">
+<w:numbering xmlns:wpc="http://schemas.microsoft.com/office/word/2010/wordprocessingCanvas" xmlns:cx="http://schemas.microsoft.com/office/drawing/2014/chartex" xmlns:cx1="http://schemas.microsoft.com/office/drawing/2015/9/8/chartex" xmlns:cx2="http://schemas.microsoft.com/office/drawing/2015/10/21/chartex" xmlns:cx3="http://schemas.microsoft.com/office/drawing/2016/5/9/chartex" xmlns:cx4="http://schemas.microsoft.com/office/drawing/2016/5/10/chartex" xmlns:cx5="http://schemas.microsoft.com/office/drawing/2016/5/11/chartex" xmlns:cx6="http://schemas.microsoft.com/office/drawing/2016/5/12/chartex" xmlns:cx7="http://schemas.microsoft.com/office/drawing/2016/5/13/chartex" xmlns:cx8="http://schemas.microsoft.com/office/drawing/2016/5/14/chartex" xmlns:mc="http://schemas.openxmlformats.org/markup-compatibility/2006" xmlns:aink="http://schemas.microsoft.com/office/drawing/2016/ink" xmlns:am3d="http://schemas.microsoft.com/office/drawing/2017/model3d" xmlns:o="urn:schemas-microsoft-com:office:office" xmlns:oel="http://schemas.microsoft.com/office/2019/extlst" xmlns:r="http://schemas.openxmlformats.org/officeDocument/2006/relationships" xmlns:m="http://schemas.openxmlformats.org/officeDocument/2006/math" xmlns:v="urn:schemas-microsoft-com:vml" xmlns:wp14="http://schemas.microsoft.com/office/word/2010/wordprocessingDrawing" xmlns:wp="http://schemas.openxmlformats.org/drawingml/2006/wordprocessingDrawing" xmlns:w10="urn:schemas-microsoft-com:office:word" xmlns:w="http://schemas.openxmlformats.org/wordprocessingml/2006/main" xmlns:w14="http://schemas.microsoft.com/office/word/2010/wordml" xmlns:w15="http://schemas.microsoft.com/office/word/2012/wordml" xmlns:w16cex="http://schemas.microsoft.com/office/word/2018/wordml/cex" xmlns:w16cid="http://schemas.microsoft.com/office/word/2016/wordml/cid" xmlns:w16="http://schemas.microsoft.com/office/word/2018/wordml" xmlns:w16du="http://schemas.microsoft.com/office/word/2023/wordml/word16du" xmlns:w16sdtdh="http://schemas.microsoft.com/office/word/2020/wordml/sdtdatahash" xmlns:w16sdtfl="http://schemas.microsoft.com/office/word/2024/wordml/sdtformatlock" xmlns:w16se="http://schemas.microsoft.com/office/word/2015/wordml/symex" xmlns:wpg="http://schemas.microsoft.com/office/word/2010/wordprocessingGroup" xmlns:wpi="http://schemas.microsoft.com/office/word/2010/wordprocessingInk" xmlns:wne="http://schemas.microsoft.com/office/word/2006/wordml" xmlns:wps="http://schemas.microsoft.com/office/word/2010/wordprocessingShape" mc:Ignorable="w14 w15 w16se w16cid w16 w16cex w16sdtdh w16sdtfl w16du wp14">
+  <w:abstractNum w:abstractNumId="0" w15:restartNumberingAfterBreak="0">
+    <w:nsid w:val="488F6C75"/>
+    <w:multiLevelType w:val="multilevel"/>
+    <w:tmpl w:val="41F4B3E2"/>
     <w:lvl w:ilvl="0">
       <w:start w:val="1"/>
       <w:numFmt w:val="decimal"/>
@@ -579,7 +559,10 @@
       </w:rPr>
     </w:lvl>
   </w:abstractNum>
-  <w:abstractNum w:abstractNumId="2">
+  <w:abstractNum w:abstractNumId="1" w15:restartNumberingAfterBreak="0">
+    <w:nsid w:val="5113069C"/>
+    <w:multiLevelType w:val="multilevel"/>
+    <w:tmpl w:val="9640BF94"/>
     <w:lvl w:ilvl="0">
       <w:start w:val="1"/>
       <w:numFmt w:val="decimal"/>
@@ -689,24 +672,24 @@
       </w:rPr>
     </w:lvl>
   </w:abstractNum>
-  <w:num w:numId="1">
+  <w:num w:numId="1" w16cid:durableId="1733888208">
+    <w:abstractNumId w:val="0"/>
+  </w:num>
+  <w:num w:numId="2" w16cid:durableId="1795170687">
     <w:abstractNumId w:val="1"/>
-  </w:num>
-  <w:num w:numId="2">
-    <w:abstractNumId w:val="2"/>
   </w:num>
 </w:numbering>
 </file>
 
 <file path=word/styles.xml><?xml version="1.0" encoding="utf-8"?>
-<w:styles xmlns:mc="http://schemas.openxmlformats.org/markup-compatibility/2006" xmlns:o="urn:schemas-microsoft-com:office:office" xmlns:r="http://schemas.openxmlformats.org/officeDocument/2006/relationships" xmlns:m="http://schemas.openxmlformats.org/officeDocument/2006/math" xmlns:v="urn:schemas-microsoft-com:vml" xmlns:wp="http://schemas.openxmlformats.org/drawingml/2006/wordprocessingDrawing" xmlns:w10="urn:schemas-microsoft-com:office:word" xmlns:w="http://schemas.openxmlformats.org/wordprocessingml/2006/main" xmlns:wne="http://schemas.microsoft.com/office/word/2006/wordml" xmlns:sl="http://schemas.openxmlformats.org/schemaLibrary/2006/main" xmlns:a="http://schemas.openxmlformats.org/drawingml/2006/main" xmlns:pic="http://schemas.openxmlformats.org/drawingml/2006/picture" xmlns:c="http://schemas.openxmlformats.org/drawingml/2006/chart" xmlns:lc="http://schemas.openxmlformats.org/drawingml/2006/lockedCanvas" xmlns:dgm="http://schemas.openxmlformats.org/drawingml/2006/diagram" xmlns:wps="http://schemas.microsoft.com/office/word/2010/wordprocessingShape" xmlns:wpg="http://schemas.microsoft.com/office/word/2010/wordprocessingGroup" xmlns:w14="http://schemas.microsoft.com/office/word/2010/wordml" xmlns:w15="http://schemas.microsoft.com/office/word/2012/wordml" xmlns:w16="http://schemas.microsoft.com/office/word/2018/wordml" xmlns:w16cex="http://schemas.microsoft.com/office/word/2018/wordml/cex" xmlns:w16cid="http://schemas.microsoft.com/office/word/2016/wordml/cid" xmlns="http://schemas.microsoft.com/office/tasks/2019/documenttasks" xmlns:cr="http://schemas.microsoft.com/office/comments/2020/reactions">
+<w:styles xmlns:mc="http://schemas.openxmlformats.org/markup-compatibility/2006" xmlns:r="http://schemas.openxmlformats.org/officeDocument/2006/relationships" xmlns:w="http://schemas.openxmlformats.org/wordprocessingml/2006/main" xmlns:w14="http://schemas.microsoft.com/office/word/2010/wordml" xmlns:w15="http://schemas.microsoft.com/office/word/2012/wordml" xmlns:w16cex="http://schemas.microsoft.com/office/word/2018/wordml/cex" xmlns:w16cid="http://schemas.microsoft.com/office/word/2016/wordml/cid" xmlns:w16="http://schemas.microsoft.com/office/word/2018/wordml" xmlns:w16du="http://schemas.microsoft.com/office/word/2023/wordml/word16du" xmlns:w16sdtdh="http://schemas.microsoft.com/office/word/2020/wordml/sdtdatahash" xmlns:w16sdtfl="http://schemas.microsoft.com/office/word/2024/wordml/sdtformatlock" xmlns:w16se="http://schemas.microsoft.com/office/word/2015/wordml/symex" mc:Ignorable="w14 w15 w16se w16cid w16 w16cex w16sdtdh w16sdtfl w16du">
   <w:docDefaults>
     <w:rPrDefault>
       <w:rPr>
-        <w:rFonts w:ascii="Arial" w:cs="Arial" w:eastAsia="Arial" w:hAnsi="Arial"/>
+        <w:rFonts w:ascii="Arial" w:eastAsia="Arial" w:hAnsi="Arial" w:cs="Arial"/>
         <w:sz w:val="22"/>
         <w:szCs w:val="22"/>
-        <w:lang w:val="en"/>
+        <w:lang w:val="en" w:eastAsia="en-US" w:bidi="ar-SA"/>
       </w:rPr>
     </w:rPrDefault>
     <w:pPrDefault>
@@ -715,29 +698,400 @@
       </w:pPr>
     </w:pPrDefault>
   </w:docDefaults>
-  <w:style w:type="table" w:styleId="TableNormal" w:default="1">
-    <w:name w:val="TableNormal"/>
-    <w:tblPr>
-      <w:tblCellMar>
-        <w:top w:w="100.0" w:type="dxa"/>
-        <w:left w:w="100.0" w:type="dxa"/>
-        <w:bottom w:w="100.0" w:type="dxa"/>
-        <w:right w:w="100.0" w:type="dxa"/>
-      </w:tblCellMar>
-    </w:tblPr>
-  </w:style>
-  <w:style w:type="paragraph" w:styleId="Normal" w:default="1">
-    <w:name w:val="normal"/>
+  <w:latentStyles w:defLockedState="0" w:defUIPriority="99" w:defSemiHidden="0" w:defUnhideWhenUsed="0" w:defQFormat="0" w:count="376">
+    <w:lsdException w:name="Normal" w:uiPriority="0" w:qFormat="1"/>
+    <w:lsdException w:name="heading 1" w:uiPriority="9" w:qFormat="1"/>
+    <w:lsdException w:name="heading 2" w:semiHidden="1" w:uiPriority="9" w:unhideWhenUsed="1" w:qFormat="1"/>
+    <w:lsdException w:name="heading 3" w:semiHidden="1" w:uiPriority="9" w:unhideWhenUsed="1" w:qFormat="1"/>
+    <w:lsdException w:name="heading 4" w:semiHidden="1" w:uiPriority="9" w:unhideWhenUsed="1" w:qFormat="1"/>
+    <w:lsdException w:name="heading 5" w:semiHidden="1" w:uiPriority="9" w:unhideWhenUsed="1" w:qFormat="1"/>
+    <w:lsdException w:name="heading 6" w:semiHidden="1" w:uiPriority="9" w:unhideWhenUsed="1" w:qFormat="1"/>
+    <w:lsdException w:name="heading 7" w:semiHidden="1" w:uiPriority="9" w:unhideWhenUsed="1" w:qFormat="1"/>
+    <w:lsdException w:name="heading 8" w:semiHidden="1" w:uiPriority="9" w:unhideWhenUsed="1" w:qFormat="1"/>
+    <w:lsdException w:name="heading 9" w:semiHidden="1" w:uiPriority="9" w:unhideWhenUsed="1" w:qFormat="1"/>
+    <w:lsdException w:name="index 1" w:semiHidden="1" w:unhideWhenUsed="1"/>
+    <w:lsdException w:name="index 2" w:semiHidden="1" w:unhideWhenUsed="1"/>
+    <w:lsdException w:name="index 3" w:semiHidden="1" w:unhideWhenUsed="1"/>
+    <w:lsdException w:name="index 4" w:semiHidden="1" w:unhideWhenUsed="1"/>
+    <w:lsdException w:name="index 5" w:semiHidden="1" w:unhideWhenUsed="1"/>
+    <w:lsdException w:name="index 6" w:semiHidden="1" w:unhideWhenUsed="1"/>
+    <w:lsdException w:name="index 7" w:semiHidden="1" w:unhideWhenUsed="1"/>
+    <w:lsdException w:name="index 8" w:semiHidden="1" w:unhideWhenUsed="1"/>
+    <w:lsdException w:name="index 9" w:semiHidden="1" w:unhideWhenUsed="1"/>
+    <w:lsdException w:name="toc 1" w:semiHidden="1" w:uiPriority="39" w:unhideWhenUsed="1"/>
+    <w:lsdException w:name="toc 2" w:semiHidden="1" w:uiPriority="39" w:unhideWhenUsed="1"/>
+    <w:lsdException w:name="toc 3" w:semiHidden="1" w:uiPriority="39" w:unhideWhenUsed="1"/>
+    <w:lsdException w:name="toc 4" w:semiHidden="1" w:uiPriority="39" w:unhideWhenUsed="1"/>
+    <w:lsdException w:name="toc 5" w:semiHidden="1" w:uiPriority="39" w:unhideWhenUsed="1"/>
+    <w:lsdException w:name="toc 6" w:semiHidden="1" w:uiPriority="39" w:unhideWhenUsed="1"/>
+    <w:lsdException w:name="toc 7" w:semiHidden="1" w:uiPriority="39" w:unhideWhenUsed="1"/>
+    <w:lsdException w:name="toc 8" w:semiHidden="1" w:uiPriority="39" w:unhideWhenUsed="1"/>
+    <w:lsdException w:name="toc 9" w:semiHidden="1" w:uiPriority="39" w:unhideWhenUsed="1"/>
+    <w:lsdException w:name="Normal Indent" w:semiHidden="1" w:unhideWhenUsed="1"/>
+    <w:lsdException w:name="footnote text" w:semiHidden="1" w:unhideWhenUsed="1"/>
+    <w:lsdException w:name="annotation text" w:semiHidden="1" w:unhideWhenUsed="1"/>
+    <w:lsdException w:name="header" w:semiHidden="1" w:unhideWhenUsed="1"/>
+    <w:lsdException w:name="footer" w:semiHidden="1" w:unhideWhenUsed="1"/>
+    <w:lsdException w:name="index heading" w:semiHidden="1" w:unhideWhenUsed="1"/>
+    <w:lsdException w:name="caption" w:semiHidden="1" w:uiPriority="35" w:unhideWhenUsed="1" w:qFormat="1"/>
+    <w:lsdException w:name="table of figures" w:semiHidden="1" w:unhideWhenUsed="1"/>
+    <w:lsdException w:name="envelope address" w:semiHidden="1" w:unhideWhenUsed="1"/>
+    <w:lsdException w:name="envelope return" w:semiHidden="1" w:unhideWhenUsed="1"/>
+    <w:lsdException w:name="footnote reference" w:semiHidden="1" w:unhideWhenUsed="1"/>
+    <w:lsdException w:name="annotation reference" w:semiHidden="1" w:unhideWhenUsed="1"/>
+    <w:lsdException w:name="line number" w:semiHidden="1" w:unhideWhenUsed="1"/>
+    <w:lsdException w:name="page number" w:semiHidden="1" w:unhideWhenUsed="1"/>
+    <w:lsdException w:name="endnote reference" w:semiHidden="1" w:unhideWhenUsed="1"/>
+    <w:lsdException w:name="endnote text" w:semiHidden="1" w:unhideWhenUsed="1"/>
+    <w:lsdException w:name="table of authorities" w:semiHidden="1" w:unhideWhenUsed="1"/>
+    <w:lsdException w:name="macro" w:semiHidden="1" w:unhideWhenUsed="1"/>
+    <w:lsdException w:name="toa heading" w:semiHidden="1" w:unhideWhenUsed="1"/>
+    <w:lsdException w:name="List" w:semiHidden="1" w:unhideWhenUsed="1"/>
+    <w:lsdException w:name="List Bullet" w:semiHidden="1" w:unhideWhenUsed="1"/>
+    <w:lsdException w:name="List Number" w:semiHidden="1" w:unhideWhenUsed="1"/>
+    <w:lsdException w:name="List 2" w:semiHidden="1" w:unhideWhenUsed="1"/>
+    <w:lsdException w:name="List 3" w:semiHidden="1" w:unhideWhenUsed="1"/>
+    <w:lsdException w:name="List 4" w:semiHidden="1" w:unhideWhenUsed="1"/>
+    <w:lsdException w:name="List 5" w:semiHidden="1" w:unhideWhenUsed="1"/>
+    <w:lsdException w:name="List Bullet 2" w:semiHidden="1" w:unhideWhenUsed="1"/>
+    <w:lsdException w:name="List Bullet 3" w:semiHidden="1" w:unhideWhenUsed="1"/>
+    <w:lsdException w:name="List Bullet 4" w:semiHidden="1" w:unhideWhenUsed="1"/>
+    <w:lsdException w:name="List Bullet 5" w:semiHidden="1" w:unhideWhenUsed="1"/>
+    <w:lsdException w:name="List Number 2" w:semiHidden="1" w:unhideWhenUsed="1"/>
+    <w:lsdException w:name="List Number 3" w:semiHidden="1" w:unhideWhenUsed="1"/>
+    <w:lsdException w:name="List Number 4" w:semiHidden="1" w:unhideWhenUsed="1"/>
+    <w:lsdException w:name="List Number 5" w:semiHidden="1" w:unhideWhenUsed="1"/>
+    <w:lsdException w:name="Title" w:uiPriority="10" w:qFormat="1"/>
+    <w:lsdException w:name="Closing" w:semiHidden="1" w:unhideWhenUsed="1"/>
+    <w:lsdException w:name="Signature" w:semiHidden="1" w:unhideWhenUsed="1"/>
+    <w:lsdException w:name="Default Paragraph Font" w:semiHidden="1" w:uiPriority="1" w:unhideWhenUsed="1"/>
+    <w:lsdException w:name="Body Text" w:semiHidden="1" w:unhideWhenUsed="1"/>
+    <w:lsdException w:name="Body Text Indent" w:semiHidden="1" w:unhideWhenUsed="1"/>
+    <w:lsdException w:name="List Continue" w:semiHidden="1" w:unhideWhenUsed="1"/>
+    <w:lsdException w:name="List Continue 2" w:semiHidden="1" w:unhideWhenUsed="1"/>
+    <w:lsdException w:name="List Continue 3" w:semiHidden="1" w:unhideWhenUsed="1"/>
+    <w:lsdException w:name="List Continue 4" w:semiHidden="1" w:unhideWhenUsed="1"/>
+    <w:lsdException w:name="List Continue 5" w:semiHidden="1" w:unhideWhenUsed="1"/>
+    <w:lsdException w:name="Message Header" w:semiHidden="1" w:unhideWhenUsed="1"/>
+    <w:lsdException w:name="Subtitle" w:uiPriority="11" w:qFormat="1"/>
+    <w:lsdException w:name="Salutation" w:semiHidden="1" w:unhideWhenUsed="1"/>
+    <w:lsdException w:name="Date" w:semiHidden="1" w:unhideWhenUsed="1"/>
+    <w:lsdException w:name="Body Text First Indent" w:semiHidden="1" w:unhideWhenUsed="1"/>
+    <w:lsdException w:name="Body Text First Indent 2" w:semiHidden="1" w:unhideWhenUsed="1"/>
+    <w:lsdException w:name="Note Heading" w:semiHidden="1" w:unhideWhenUsed="1"/>
+    <w:lsdException w:name="Body Text 2" w:semiHidden="1" w:unhideWhenUsed="1"/>
+    <w:lsdException w:name="Body Text 3" w:semiHidden="1" w:unhideWhenUsed="1"/>
+    <w:lsdException w:name="Body Text Indent 2" w:semiHidden="1" w:unhideWhenUsed="1"/>
+    <w:lsdException w:name="Body Text Indent 3" w:semiHidden="1" w:unhideWhenUsed="1"/>
+    <w:lsdException w:name="Block Text" w:semiHidden="1" w:unhideWhenUsed="1"/>
+    <w:lsdException w:name="Hyperlink" w:semiHidden="1" w:unhideWhenUsed="1"/>
+    <w:lsdException w:name="FollowedHyperlink" w:semiHidden="1" w:unhideWhenUsed="1"/>
+    <w:lsdException w:name="Strong" w:uiPriority="22" w:qFormat="1"/>
+    <w:lsdException w:name="Emphasis" w:uiPriority="20" w:qFormat="1"/>
+    <w:lsdException w:name="Document Map" w:semiHidden="1" w:unhideWhenUsed="1"/>
+    <w:lsdException w:name="Plain Text" w:semiHidden="1" w:unhideWhenUsed="1"/>
+    <w:lsdException w:name="E-mail Signature" w:semiHidden="1" w:unhideWhenUsed="1"/>
+    <w:lsdException w:name="HTML Top of Form" w:semiHidden="1" w:unhideWhenUsed="1"/>
+    <w:lsdException w:name="HTML Bottom of Form" w:semiHidden="1" w:unhideWhenUsed="1"/>
+    <w:lsdException w:name="Normal (Web)" w:semiHidden="1" w:unhideWhenUsed="1"/>
+    <w:lsdException w:name="HTML Acronym" w:semiHidden="1" w:unhideWhenUsed="1"/>
+    <w:lsdException w:name="HTML Address" w:semiHidden="1" w:unhideWhenUsed="1"/>
+    <w:lsdException w:name="HTML Cite" w:semiHidden="1" w:unhideWhenUsed="1"/>
+    <w:lsdException w:name="HTML Code" w:semiHidden="1" w:unhideWhenUsed="1"/>
+    <w:lsdException w:name="HTML Definition" w:semiHidden="1" w:unhideWhenUsed="1"/>
+    <w:lsdException w:name="HTML Keyboard" w:semiHidden="1" w:unhideWhenUsed="1"/>
+    <w:lsdException w:name="HTML Preformatted" w:semiHidden="1" w:unhideWhenUsed="1"/>
+    <w:lsdException w:name="HTML Sample" w:semiHidden="1" w:unhideWhenUsed="1"/>
+    <w:lsdException w:name="HTML Typewriter" w:semiHidden="1" w:unhideWhenUsed="1"/>
+    <w:lsdException w:name="HTML Variable" w:semiHidden="1" w:unhideWhenUsed="1"/>
+    <w:lsdException w:name="Normal Table" w:semiHidden="1" w:unhideWhenUsed="1"/>
+    <w:lsdException w:name="annotation subject" w:semiHidden="1" w:unhideWhenUsed="1"/>
+    <w:lsdException w:name="No List" w:semiHidden="1" w:unhideWhenUsed="1"/>
+    <w:lsdException w:name="Outline List 1" w:semiHidden="1" w:unhideWhenUsed="1"/>
+    <w:lsdException w:name="Outline List 2" w:semiHidden="1" w:unhideWhenUsed="1"/>
+    <w:lsdException w:name="Outline List 3" w:semiHidden="1" w:unhideWhenUsed="1"/>
+    <w:lsdException w:name="Table Simple 1" w:semiHidden="1" w:unhideWhenUsed="1"/>
+    <w:lsdException w:name="Table Simple 2" w:semiHidden="1" w:unhideWhenUsed="1"/>
+    <w:lsdException w:name="Table Simple 3" w:semiHidden="1" w:unhideWhenUsed="1"/>
+    <w:lsdException w:name="Table Classic 1" w:semiHidden="1" w:unhideWhenUsed="1"/>
+    <w:lsdException w:name="Table Classic 2" w:semiHidden="1" w:unhideWhenUsed="1"/>
+    <w:lsdException w:name="Table Classic 3" w:semiHidden="1" w:unhideWhenUsed="1"/>
+    <w:lsdException w:name="Table Classic 4" w:semiHidden="1" w:unhideWhenUsed="1"/>
+    <w:lsdException w:name="Table Colorful 1" w:semiHidden="1" w:unhideWhenUsed="1"/>
+    <w:lsdException w:name="Table Colorful 2" w:semiHidden="1" w:unhideWhenUsed="1"/>
+    <w:lsdException w:name="Table Colorful 3" w:semiHidden="1" w:unhideWhenUsed="1"/>
+    <w:lsdException w:name="Table Columns 1" w:semiHidden="1" w:unhideWhenUsed="1"/>
+    <w:lsdException w:name="Table Columns 2" w:semiHidden="1" w:unhideWhenUsed="1"/>
+    <w:lsdException w:name="Table Columns 3" w:semiHidden="1" w:unhideWhenUsed="1"/>
+    <w:lsdException w:name="Table Columns 4" w:semiHidden="1" w:unhideWhenUsed="1"/>
+    <w:lsdException w:name="Table Columns 5" w:semiHidden="1" w:unhideWhenUsed="1"/>
+    <w:lsdException w:name="Table Grid 1" w:semiHidden="1" w:unhideWhenUsed="1"/>
+    <w:lsdException w:name="Table Grid 2" w:semiHidden="1" w:unhideWhenUsed="1"/>
+    <w:lsdException w:name="Table Grid 3" w:semiHidden="1" w:unhideWhenUsed="1"/>
+    <w:lsdException w:name="Table Grid 4" w:semiHidden="1" w:unhideWhenUsed="1"/>
+    <w:lsdException w:name="Table Grid 5" w:semiHidden="1" w:unhideWhenUsed="1"/>
+    <w:lsdException w:name="Table Grid 6" w:semiHidden="1" w:unhideWhenUsed="1"/>
+    <w:lsdException w:name="Table Grid 7" w:semiHidden="1" w:unhideWhenUsed="1"/>
+    <w:lsdException w:name="Table Grid 8" w:semiHidden="1" w:unhideWhenUsed="1"/>
+    <w:lsdException w:name="Table List 1" w:semiHidden="1" w:unhideWhenUsed="1"/>
+    <w:lsdException w:name="Table List 2" w:semiHidden="1" w:unhideWhenUsed="1"/>
+    <w:lsdException w:name="Table List 3" w:semiHidden="1" w:unhideWhenUsed="1"/>
+    <w:lsdException w:name="Table List 4" w:semiHidden="1" w:unhideWhenUsed="1"/>
+    <w:lsdException w:name="Table List 5" w:semiHidden="1" w:unhideWhenUsed="1"/>
+    <w:lsdException w:name="Table List 6" w:semiHidden="1" w:unhideWhenUsed="1"/>
+    <w:lsdException w:name="Table List 7" w:semiHidden="1" w:unhideWhenUsed="1"/>
+    <w:lsdException w:name="Table List 8" w:semiHidden="1" w:unhideWhenUsed="1"/>
+    <w:lsdException w:name="Table 3D effects 1" w:semiHidden="1" w:unhideWhenUsed="1"/>
+    <w:lsdException w:name="Table 3D effects 2" w:semiHidden="1" w:unhideWhenUsed="1"/>
+    <w:lsdException w:name="Table 3D effects 3" w:semiHidden="1" w:unhideWhenUsed="1"/>
+    <w:lsdException w:name="Table Contemporary" w:semiHidden="1" w:unhideWhenUsed="1"/>
+    <w:lsdException w:name="Table Elegant" w:semiHidden="1" w:unhideWhenUsed="1"/>
+    <w:lsdException w:name="Table Professional" w:semiHidden="1" w:unhideWhenUsed="1"/>
+    <w:lsdException w:name="Table Subtle 1" w:semiHidden="1" w:unhideWhenUsed="1"/>
+    <w:lsdException w:name="Table Subtle 2" w:semiHidden="1" w:unhideWhenUsed="1"/>
+    <w:lsdException w:name="Table Web 1" w:semiHidden="1" w:unhideWhenUsed="1"/>
+    <w:lsdException w:name="Table Web 2" w:semiHidden="1" w:unhideWhenUsed="1"/>
+    <w:lsdException w:name="Table Web 3" w:semiHidden="1" w:unhideWhenUsed="1"/>
+    <w:lsdException w:name="Balloon Text" w:semiHidden="1" w:unhideWhenUsed="1"/>
+    <w:lsdException w:name="Table Grid" w:uiPriority="39"/>
+    <w:lsdException w:name="Table Theme" w:semiHidden="1" w:unhideWhenUsed="1"/>
+    <w:lsdException w:name="Placeholder Text" w:semiHidden="1"/>
+    <w:lsdException w:name="No Spacing" w:uiPriority="1" w:qFormat="1"/>
+    <w:lsdException w:name="Light Shading" w:uiPriority="60"/>
+    <w:lsdException w:name="Light List" w:uiPriority="61"/>
+    <w:lsdException w:name="Light Grid" w:uiPriority="62"/>
+    <w:lsdException w:name="Medium Shading 1" w:uiPriority="63"/>
+    <w:lsdException w:name="Medium Shading 2" w:uiPriority="64"/>
+    <w:lsdException w:name="Medium List 1" w:uiPriority="65"/>
+    <w:lsdException w:name="Medium List 2" w:uiPriority="66"/>
+    <w:lsdException w:name="Medium Grid 1" w:uiPriority="67"/>
+    <w:lsdException w:name="Medium Grid 2" w:uiPriority="68"/>
+    <w:lsdException w:name="Medium Grid 3" w:uiPriority="69"/>
+    <w:lsdException w:name="Dark List" w:uiPriority="70"/>
+    <w:lsdException w:name="Colorful Shading" w:uiPriority="71"/>
+    <w:lsdException w:name="Colorful List" w:uiPriority="72"/>
+    <w:lsdException w:name="Colorful Grid" w:uiPriority="73"/>
+    <w:lsdException w:name="Light Shading Accent 1" w:uiPriority="60"/>
+    <w:lsdException w:name="Light List Accent 1" w:uiPriority="61"/>
+    <w:lsdException w:name="Light Grid Accent 1" w:uiPriority="62"/>
+    <w:lsdException w:name="Medium Shading 1 Accent 1" w:uiPriority="63"/>
+    <w:lsdException w:name="Medium Shading 2 Accent 1" w:uiPriority="64"/>
+    <w:lsdException w:name="Medium List 1 Accent 1" w:uiPriority="65"/>
+    <w:lsdException w:name="Revision" w:semiHidden="1"/>
+    <w:lsdException w:name="List Paragraph" w:uiPriority="34" w:qFormat="1"/>
+    <w:lsdException w:name="Quote" w:uiPriority="29" w:qFormat="1"/>
+    <w:lsdException w:name="Intense Quote" w:uiPriority="30" w:qFormat="1"/>
+    <w:lsdException w:name="Medium List 2 Accent 1" w:uiPriority="66"/>
+    <w:lsdException w:name="Medium Grid 1 Accent 1" w:uiPriority="67"/>
+    <w:lsdException w:name="Medium Grid 2 Accent 1" w:uiPriority="68"/>
+    <w:lsdException w:name="Medium Grid 3 Accent 1" w:uiPriority="69"/>
+    <w:lsdException w:name="Dark List Accent 1" w:uiPriority="70"/>
+    <w:lsdException w:name="Colorful Shading Accent 1" w:uiPriority="71"/>
+    <w:lsdException w:name="Colorful List Accent 1" w:uiPriority="72"/>
+    <w:lsdException w:name="Colorful Grid Accent 1" w:uiPriority="73"/>
+    <w:lsdException w:name="Light Shading Accent 2" w:uiPriority="60"/>
+    <w:lsdException w:name="Light List Accent 2" w:uiPriority="61"/>
+    <w:lsdException w:name="Light Grid Accent 2" w:uiPriority="62"/>
+    <w:lsdException w:name="Medium Shading 1 Accent 2" w:uiPriority="63"/>
+    <w:lsdException w:name="Medium Shading 2 Accent 2" w:uiPriority="64"/>
+    <w:lsdException w:name="Medium List 1 Accent 2" w:uiPriority="65"/>
+    <w:lsdException w:name="Medium List 2 Accent 2" w:uiPriority="66"/>
+    <w:lsdException w:name="Medium Grid 1 Accent 2" w:uiPriority="67"/>
+    <w:lsdException w:name="Medium Grid 2 Accent 2" w:uiPriority="68"/>
+    <w:lsdException w:name="Medium Grid 3 Accent 2" w:uiPriority="69"/>
+    <w:lsdException w:name="Dark List Accent 2" w:uiPriority="70"/>
+    <w:lsdException w:name="Colorful Shading Accent 2" w:uiPriority="71"/>
+    <w:lsdException w:name="Colorful List Accent 2" w:uiPriority="72"/>
+    <w:lsdException w:name="Colorful Grid Accent 2" w:uiPriority="73"/>
+    <w:lsdException w:name="Light Shading Accent 3" w:uiPriority="60"/>
+    <w:lsdException w:name="Light List Accent 3" w:uiPriority="61"/>
+    <w:lsdException w:name="Light Grid Accent 3" w:uiPriority="62"/>
+    <w:lsdException w:name="Medium Shading 1 Accent 3" w:uiPriority="63"/>
+    <w:lsdException w:name="Medium Shading 2 Accent 3" w:uiPriority="64"/>
+    <w:lsdException w:name="Medium List 1 Accent 3" w:uiPriority="65"/>
+    <w:lsdException w:name="Medium List 2 Accent 3" w:uiPriority="66"/>
+    <w:lsdException w:name="Medium Grid 1 Accent 3" w:uiPriority="67"/>
+    <w:lsdException w:name="Medium Grid 2 Accent 3" w:uiPriority="68"/>
+    <w:lsdException w:name="Medium Grid 3 Accent 3" w:uiPriority="69"/>
+    <w:lsdException w:name="Dark List Accent 3" w:uiPriority="70"/>
+    <w:lsdException w:name="Colorful Shading Accent 3" w:uiPriority="71"/>
+    <w:lsdException w:name="Colorful List Accent 3" w:uiPriority="72"/>
+    <w:lsdException w:name="Colorful Grid Accent 3" w:uiPriority="73"/>
+    <w:lsdException w:name="Light Shading Accent 4" w:uiPriority="60"/>
+    <w:lsdException w:name="Light List Accent 4" w:uiPriority="61"/>
+    <w:lsdException w:name="Light Grid Accent 4" w:uiPriority="62"/>
+    <w:lsdException w:name="Medium Shading 1 Accent 4" w:uiPriority="63"/>
+    <w:lsdException w:name="Medium Shading 2 Accent 4" w:uiPriority="64"/>
+    <w:lsdException w:name="Medium List 1 Accent 4" w:uiPriority="65"/>
+    <w:lsdException w:name="Medium List 2 Accent 4" w:uiPriority="66"/>
+    <w:lsdException w:name="Medium Grid 1 Accent 4" w:uiPriority="67"/>
+    <w:lsdException w:name="Medium Grid 2 Accent 4" w:uiPriority="68"/>
+    <w:lsdException w:name="Medium Grid 3 Accent 4" w:uiPriority="69"/>
+    <w:lsdException w:name="Dark List Accent 4" w:uiPriority="70"/>
+    <w:lsdException w:name="Colorful Shading Accent 4" w:uiPriority="71"/>
+    <w:lsdException w:name="Colorful List Accent 4" w:uiPriority="72"/>
+    <w:lsdException w:name="Colorful Grid Accent 4" w:uiPriority="73"/>
+    <w:lsdException w:name="Light Shading Accent 5" w:uiPriority="60"/>
+    <w:lsdException w:name="Light List Accent 5" w:uiPriority="61"/>
+    <w:lsdException w:name="Light Grid Accent 5" w:uiPriority="62"/>
+    <w:lsdException w:name="Medium Shading 1 Accent 5" w:uiPriority="63"/>
+    <w:lsdException w:name="Medium Shading 2 Accent 5" w:uiPriority="64"/>
+    <w:lsdException w:name="Medium List 1 Accent 5" w:uiPriority="65"/>
+    <w:lsdException w:name="Medium List 2 Accent 5" w:uiPriority="66"/>
+    <w:lsdException w:name="Medium Grid 1 Accent 5" w:uiPriority="67"/>
+    <w:lsdException w:name="Medium Grid 2 Accent 5" w:uiPriority="68"/>
+    <w:lsdException w:name="Medium Grid 3 Accent 5" w:uiPriority="69"/>
+    <w:lsdException w:name="Dark List Accent 5" w:uiPriority="70"/>
+    <w:lsdException w:name="Colorful Shading Accent 5" w:uiPriority="71"/>
+    <w:lsdException w:name="Colorful List Accent 5" w:uiPriority="72"/>
+    <w:lsdException w:name="Colorful Grid Accent 5" w:uiPriority="73"/>
+    <w:lsdException w:name="Light Shading Accent 6" w:uiPriority="60"/>
+    <w:lsdException w:name="Light List Accent 6" w:uiPriority="61"/>
+    <w:lsdException w:name="Light Grid Accent 6" w:uiPriority="62"/>
+    <w:lsdException w:name="Medium Shading 1 Accent 6" w:uiPriority="63"/>
+    <w:lsdException w:name="Medium Shading 2 Accent 6" w:uiPriority="64"/>
+    <w:lsdException w:name="Medium List 1 Accent 6" w:uiPriority="65"/>
+    <w:lsdException w:name="Medium List 2 Accent 6" w:uiPriority="66"/>
+    <w:lsdException w:name="Medium Grid 1 Accent 6" w:uiPriority="67"/>
+    <w:lsdException w:name="Medium Grid 2 Accent 6" w:uiPriority="68"/>
+    <w:lsdException w:name="Medium Grid 3 Accent 6" w:uiPriority="69"/>
+    <w:lsdException w:name="Dark List Accent 6" w:uiPriority="70"/>
+    <w:lsdException w:name="Colorful Shading Accent 6" w:uiPriority="71"/>
+    <w:lsdException w:name="Colorful List Accent 6" w:uiPriority="72"/>
+    <w:lsdException w:name="Colorful Grid Accent 6" w:uiPriority="73"/>
+    <w:lsdException w:name="Subtle Emphasis" w:uiPriority="19" w:qFormat="1"/>
+    <w:lsdException w:name="Intense Emphasis" w:uiPriority="21" w:qFormat="1"/>
+    <w:lsdException w:name="Subtle Reference" w:uiPriority="31" w:qFormat="1"/>
+    <w:lsdException w:name="Intense Reference" w:uiPriority="32" w:qFormat="1"/>
+    <w:lsdException w:name="Book Title" w:uiPriority="33" w:qFormat="1"/>
+    <w:lsdException w:name="Bibliography" w:semiHidden="1" w:uiPriority="37" w:unhideWhenUsed="1"/>
+    <w:lsdException w:name="TOC Heading" w:semiHidden="1" w:uiPriority="39" w:unhideWhenUsed="1" w:qFormat="1"/>
+    <w:lsdException w:name="Plain Table 1" w:uiPriority="41"/>
+    <w:lsdException w:name="Plain Table 2" w:uiPriority="42"/>
+    <w:lsdException w:name="Plain Table 3" w:uiPriority="43"/>
+    <w:lsdException w:name="Plain Table 4" w:uiPriority="44"/>
+    <w:lsdException w:name="Plain Table 5" w:uiPriority="45"/>
+    <w:lsdException w:name="Grid Table Light" w:uiPriority="40"/>
+    <w:lsdException w:name="Grid Table 1 Light" w:uiPriority="46"/>
+    <w:lsdException w:name="Grid Table 2" w:uiPriority="47"/>
+    <w:lsdException w:name="Grid Table 3" w:uiPriority="48"/>
+    <w:lsdException w:name="Grid Table 4" w:uiPriority="49"/>
+    <w:lsdException w:name="Grid Table 5 Dark" w:uiPriority="50"/>
+    <w:lsdException w:name="Grid Table 6 Colorful" w:uiPriority="51"/>
+    <w:lsdException w:name="Grid Table 7 Colorful" w:uiPriority="52"/>
+    <w:lsdException w:name="Grid Table 1 Light Accent 1" w:uiPriority="46"/>
+    <w:lsdException w:name="Grid Table 2 Accent 1" w:uiPriority="47"/>
+    <w:lsdException w:name="Grid Table 3 Accent 1" w:uiPriority="48"/>
+    <w:lsdException w:name="Grid Table 4 Accent 1" w:uiPriority="49"/>
+    <w:lsdException w:name="Grid Table 5 Dark Accent 1" w:uiPriority="50"/>
+    <w:lsdException w:name="Grid Table 6 Colorful Accent 1" w:uiPriority="51"/>
+    <w:lsdException w:name="Grid Table 7 Colorful Accent 1" w:uiPriority="52"/>
+    <w:lsdException w:name="Grid Table 1 Light Accent 2" w:uiPriority="46"/>
+    <w:lsdException w:name="Grid Table 2 Accent 2" w:uiPriority="47"/>
+    <w:lsdException w:name="Grid Table 3 Accent 2" w:uiPriority="48"/>
+    <w:lsdException w:name="Grid Table 4 Accent 2" w:uiPriority="49"/>
+    <w:lsdException w:name="Grid Table 5 Dark Accent 2" w:uiPriority="50"/>
+    <w:lsdException w:name="Grid Table 6 Colorful Accent 2" w:uiPriority="51"/>
+    <w:lsdException w:name="Grid Table 7 Colorful Accent 2" w:uiPriority="52"/>
+    <w:lsdException w:name="Grid Table 1 Light Accent 3" w:uiPriority="46"/>
+    <w:lsdException w:name="Grid Table 2 Accent 3" w:uiPriority="47"/>
+    <w:lsdException w:name="Grid Table 3 Accent 3" w:uiPriority="48"/>
+    <w:lsdException w:name="Grid Table 4 Accent 3" w:uiPriority="49"/>
+    <w:lsdException w:name="Grid Table 5 Dark Accent 3" w:uiPriority="50"/>
+    <w:lsdException w:name="Grid Table 6 Colorful Accent 3" w:uiPriority="51"/>
+    <w:lsdException w:name="Grid Table 7 Colorful Accent 3" w:uiPriority="52"/>
+    <w:lsdException w:name="Grid Table 1 Light Accent 4" w:uiPriority="46"/>
+    <w:lsdException w:name="Grid Table 2 Accent 4" w:uiPriority="47"/>
+    <w:lsdException w:name="Grid Table 3 Accent 4" w:uiPriority="48"/>
+    <w:lsdException w:name="Grid Table 4 Accent 4" w:uiPriority="49"/>
+    <w:lsdException w:name="Grid Table 5 Dark Accent 4" w:uiPriority="50"/>
+    <w:lsdException w:name="Grid Table 6 Colorful Accent 4" w:uiPriority="51"/>
+    <w:lsdException w:name="Grid Table 7 Colorful Accent 4" w:uiPriority="52"/>
+    <w:lsdException w:name="Grid Table 1 Light Accent 5" w:uiPriority="46"/>
+    <w:lsdException w:name="Grid Table 2 Accent 5" w:uiPriority="47"/>
+    <w:lsdException w:name="Grid Table 3 Accent 5" w:uiPriority="48"/>
+    <w:lsdException w:name="Grid Table 4 Accent 5" w:uiPriority="49"/>
+    <w:lsdException w:name="Grid Table 5 Dark Accent 5" w:uiPriority="50"/>
+    <w:lsdException w:name="Grid Table 6 Colorful Accent 5" w:uiPriority="51"/>
+    <w:lsdException w:name="Grid Table 7 Colorful Accent 5" w:uiPriority="52"/>
+    <w:lsdException w:name="Grid Table 1 Light Accent 6" w:uiPriority="46"/>
+    <w:lsdException w:name="Grid Table 2 Accent 6" w:uiPriority="47"/>
+    <w:lsdException w:name="Grid Table 3 Accent 6" w:uiPriority="48"/>
+    <w:lsdException w:name="Grid Table 4 Accent 6" w:uiPriority="49"/>
+    <w:lsdException w:name="Grid Table 5 Dark Accent 6" w:uiPriority="50"/>
+    <w:lsdException w:name="Grid Table 6 Colorful Accent 6" w:uiPriority="51"/>
+    <w:lsdException w:name="Grid Table 7 Colorful Accent 6" w:uiPriority="52"/>
+    <w:lsdException w:name="List Table 1 Light" w:uiPriority="46"/>
+    <w:lsdException w:name="List Table 2" w:uiPriority="47"/>
+    <w:lsdException w:name="List Table 3" w:uiPriority="48"/>
+    <w:lsdException w:name="List Table 4" w:uiPriority="49"/>
+    <w:lsdException w:name="List Table 5 Dark" w:uiPriority="50"/>
+    <w:lsdException w:name="List Table 6 Colorful" w:uiPriority="51"/>
+    <w:lsdException w:name="List Table 7 Colorful" w:uiPriority="52"/>
+    <w:lsdException w:name="List Table 1 Light Accent 1" w:uiPriority="46"/>
+    <w:lsdException w:name="List Table 2 Accent 1" w:uiPriority="47"/>
+    <w:lsdException w:name="List Table 3 Accent 1" w:uiPriority="48"/>
+    <w:lsdException w:name="List Table 4 Accent 1" w:uiPriority="49"/>
+    <w:lsdException w:name="List Table 5 Dark Accent 1" w:uiPriority="50"/>
+    <w:lsdException w:name="List Table 6 Colorful Accent 1" w:uiPriority="51"/>
+    <w:lsdException w:name="List Table 7 Colorful Accent 1" w:uiPriority="52"/>
+    <w:lsdException w:name="List Table 1 Light Accent 2" w:uiPriority="46"/>
+    <w:lsdException w:name="List Table 2 Accent 2" w:uiPriority="47"/>
+    <w:lsdException w:name="List Table 3 Accent 2" w:uiPriority="48"/>
+    <w:lsdException w:name="List Table 4 Accent 2" w:uiPriority="49"/>
+    <w:lsdException w:name="List Table 5 Dark Accent 2" w:uiPriority="50"/>
+    <w:lsdException w:name="List Table 6 Colorful Accent 2" w:uiPriority="51"/>
+    <w:lsdException w:name="List Table 7 Colorful Accent 2" w:uiPriority="52"/>
+    <w:lsdException w:name="List Table 1 Light Accent 3" w:uiPriority="46"/>
+    <w:lsdException w:name="List Table 2 Accent 3" w:uiPriority="47"/>
+    <w:lsdException w:name="List Table 3 Accent 3" w:uiPriority="48"/>
+    <w:lsdException w:name="List Table 4 Accent 3" w:uiPriority="49"/>
+    <w:lsdException w:name="List Table 5 Dark Accent 3" w:uiPriority="50"/>
+    <w:lsdException w:name="List Table 6 Colorful Accent 3" w:uiPriority="51"/>
+    <w:lsdException w:name="List Table 7 Colorful Accent 3" w:uiPriority="52"/>
+    <w:lsdException w:name="List Table 1 Light Accent 4" w:uiPriority="46"/>
+    <w:lsdException w:name="List Table 2 Accent 4" w:uiPriority="47"/>
+    <w:lsdException w:name="List Table 3 Accent 4" w:uiPriority="48"/>
+    <w:lsdException w:name="List Table 4 Accent 4" w:uiPriority="49"/>
+    <w:lsdException w:name="List Table 5 Dark Accent 4" w:uiPriority="50"/>
+    <w:lsdException w:name="List Table 6 Colorful Accent 4" w:uiPriority="51"/>
+    <w:lsdException w:name="List Table 7 Colorful Accent 4" w:uiPriority="52"/>
+    <w:lsdException w:name="List Table 1 Light Accent 5" w:uiPriority="46"/>
+    <w:lsdException w:name="List Table 2 Accent 5" w:uiPriority="47"/>
+    <w:lsdException w:name="List Table 3 Accent 5" w:uiPriority="48"/>
+    <w:lsdException w:name="List Table 4 Accent 5" w:uiPriority="49"/>
+    <w:lsdException w:name="List Table 5 Dark Accent 5" w:uiPriority="50"/>
+    <w:lsdException w:name="List Table 6 Colorful Accent 5" w:uiPriority="51"/>
+    <w:lsdException w:name="List Table 7 Colorful Accent 5" w:uiPriority="52"/>
+    <w:lsdException w:name="List Table 1 Light Accent 6" w:uiPriority="46"/>
+    <w:lsdException w:name="List Table 2 Accent 6" w:uiPriority="47"/>
+    <w:lsdException w:name="List Table 3 Accent 6" w:uiPriority="48"/>
+    <w:lsdException w:name="List Table 4 Accent 6" w:uiPriority="49"/>
+    <w:lsdException w:name="List Table 5 Dark Accent 6" w:uiPriority="50"/>
+    <w:lsdException w:name="List Table 6 Colorful Accent 6" w:uiPriority="51"/>
+    <w:lsdException w:name="List Table 7 Colorful Accent 6" w:uiPriority="52"/>
+    <w:lsdException w:name="Mention" w:semiHidden="1" w:unhideWhenUsed="1"/>
+    <w:lsdException w:name="Smart Hyperlink" w:semiHidden="1" w:unhideWhenUsed="1"/>
+    <w:lsdException w:name="Hashtag" w:semiHidden="1" w:unhideWhenUsed="1"/>
+    <w:lsdException w:name="Unresolved Mention" w:semiHidden="1" w:unhideWhenUsed="1"/>
+    <w:lsdException w:name="Smart Link" w:semiHidden="1" w:unhideWhenUsed="1"/>
+  </w:latentStyles>
+  <w:style w:type="paragraph" w:default="1" w:styleId="Normal">
+    <w:name w:val="Normal"/>
+    <w:qFormat/>
+    <w:rsid w:val="00804420"/>
   </w:style>
   <w:style w:type="paragraph" w:styleId="Heading1">
     <w:name w:val="heading 1"/>
     <w:basedOn w:val="Normal"/>
     <w:next w:val="Normal"/>
+    <w:uiPriority w:val="9"/>
+    <w:qFormat/>
     <w:pPr>
-      <w:keepNext w:val="1"/>
-      <w:keepLines w:val="1"/>
-      <w:pageBreakBefore w:val="0"/>
-      <w:spacing w:after="120" w:before="400" w:lineRule="auto"/>
+      <w:keepNext/>
+      <w:keepLines/>
+      <w:spacing w:before="400" w:after="120"/>
+      <w:outlineLvl w:val="0"/>
     </w:pPr>
     <w:rPr>
       <w:sz w:val="40"/>
@@ -748,15 +1102,17 @@
     <w:name w:val="heading 2"/>
     <w:basedOn w:val="Normal"/>
     <w:next w:val="Normal"/>
+    <w:uiPriority w:val="9"/>
+    <w:semiHidden/>
+    <w:unhideWhenUsed/>
+    <w:qFormat/>
     <w:pPr>
-      <w:keepNext w:val="1"/>
-      <w:keepLines w:val="1"/>
-      <w:pageBreakBefore w:val="0"/>
-      <w:spacing w:after="120" w:before="360" w:lineRule="auto"/>
+      <w:keepNext/>
+      <w:keepLines/>
+      <w:spacing w:before="360" w:after="120"/>
+      <w:outlineLvl w:val="1"/>
     </w:pPr>
     <w:rPr>
-      <w:b w:val="0"/>
-      <w:bCs w:val="0"/>
       <w:sz w:val="32"/>
       <w:szCs w:val="32"/>
     </w:rPr>
@@ -765,15 +1121,17 @@
     <w:name w:val="heading 3"/>
     <w:basedOn w:val="Normal"/>
     <w:next w:val="Normal"/>
+    <w:uiPriority w:val="9"/>
+    <w:semiHidden/>
+    <w:unhideWhenUsed/>
+    <w:qFormat/>
     <w:pPr>
-      <w:keepNext w:val="1"/>
-      <w:keepLines w:val="1"/>
-      <w:pageBreakBefore w:val="0"/>
-      <w:spacing w:after="80" w:before="320" w:lineRule="auto"/>
+      <w:keepNext/>
+      <w:keepLines/>
+      <w:spacing w:before="320" w:after="80"/>
+      <w:outlineLvl w:val="2"/>
     </w:pPr>
     <w:rPr>
-      <w:b w:val="0"/>
-      <w:bCs w:val="0"/>
       <w:color w:val="434343"/>
       <w:sz w:val="28"/>
       <w:szCs w:val="28"/>
@@ -783,11 +1141,15 @@
     <w:name w:val="heading 4"/>
     <w:basedOn w:val="Normal"/>
     <w:next w:val="Normal"/>
+    <w:uiPriority w:val="9"/>
+    <w:semiHidden/>
+    <w:unhideWhenUsed/>
+    <w:qFormat/>
     <w:pPr>
-      <w:keepNext w:val="1"/>
-      <w:keepLines w:val="1"/>
-      <w:pageBreakBefore w:val="0"/>
-      <w:spacing w:after="80" w:before="280" w:lineRule="auto"/>
+      <w:keepNext/>
+      <w:keepLines/>
+      <w:spacing w:before="280" w:after="80"/>
+      <w:outlineLvl w:val="3"/>
     </w:pPr>
     <w:rPr>
       <w:color w:val="666666"/>
@@ -799,45 +1161,88 @@
     <w:name w:val="heading 5"/>
     <w:basedOn w:val="Normal"/>
     <w:next w:val="Normal"/>
+    <w:uiPriority w:val="9"/>
+    <w:semiHidden/>
+    <w:unhideWhenUsed/>
+    <w:qFormat/>
     <w:pPr>
-      <w:keepNext w:val="1"/>
-      <w:keepLines w:val="1"/>
-      <w:pageBreakBefore w:val="0"/>
-      <w:spacing w:after="80" w:before="240" w:lineRule="auto"/>
+      <w:keepNext/>
+      <w:keepLines/>
+      <w:spacing w:before="240" w:after="80"/>
+      <w:outlineLvl w:val="4"/>
     </w:pPr>
     <w:rPr>
       <w:color w:val="666666"/>
-      <w:sz w:val="22"/>
-      <w:szCs w:val="22"/>
     </w:rPr>
   </w:style>
   <w:style w:type="paragraph" w:styleId="Heading6">
     <w:name w:val="heading 6"/>
     <w:basedOn w:val="Normal"/>
     <w:next w:val="Normal"/>
+    <w:uiPriority w:val="9"/>
+    <w:semiHidden/>
+    <w:unhideWhenUsed/>
+    <w:qFormat/>
     <w:pPr>
-      <w:keepNext w:val="1"/>
-      <w:keepLines w:val="1"/>
-      <w:pageBreakBefore w:val="0"/>
-      <w:spacing w:after="80" w:before="240" w:lineRule="auto"/>
+      <w:keepNext/>
+      <w:keepLines/>
+      <w:spacing w:before="240" w:after="80"/>
+      <w:outlineLvl w:val="5"/>
     </w:pPr>
     <w:rPr>
-      <w:i w:val="1"/>
-      <w:iCs w:val="1"/>
+      <w:i/>
+      <w:iCs/>
       <w:color w:val="666666"/>
-      <w:sz w:val="22"/>
-      <w:szCs w:val="22"/>
     </w:rPr>
+  </w:style>
+  <w:style w:type="character" w:default="1" w:styleId="DefaultParagraphFont">
+    <w:name w:val="Default Paragraph Font"/>
+    <w:uiPriority w:val="1"/>
+    <w:semiHidden/>
+    <w:unhideWhenUsed/>
+  </w:style>
+  <w:style w:type="table" w:default="1" w:styleId="TableNormal">
+    <w:name w:val="Normal Table"/>
+    <w:uiPriority w:val="99"/>
+    <w:semiHidden/>
+    <w:unhideWhenUsed/>
+    <w:tblPr>
+      <w:tblInd w:w="0" w:type="dxa"/>
+      <w:tblCellMar>
+        <w:top w:w="0" w:type="dxa"/>
+        <w:left w:w="108" w:type="dxa"/>
+        <w:bottom w:w="0" w:type="dxa"/>
+        <w:right w:w="108" w:type="dxa"/>
+      </w:tblCellMar>
+    </w:tblPr>
+  </w:style>
+  <w:style w:type="numbering" w:default="1" w:styleId="NoList">
+    <w:name w:val="No List"/>
+    <w:uiPriority w:val="99"/>
+    <w:semiHidden/>
+    <w:unhideWhenUsed/>
+  </w:style>
+  <w:style w:type="table" w:customStyle="1" w:styleId="TableNormal0">
+    <w:name w:val="TableNormal"/>
+    <w:tblPr>
+      <w:tblCellMar>
+        <w:top w:w="100" w:type="dxa"/>
+        <w:left w:w="100" w:type="dxa"/>
+        <w:bottom w:w="100" w:type="dxa"/>
+        <w:right w:w="100" w:type="dxa"/>
+      </w:tblCellMar>
+    </w:tblPr>
   </w:style>
   <w:style w:type="paragraph" w:styleId="Title">
     <w:name w:val="Title"/>
     <w:basedOn w:val="Normal"/>
     <w:next w:val="Normal"/>
+    <w:uiPriority w:val="10"/>
+    <w:qFormat/>
     <w:pPr>
-      <w:keepNext w:val="1"/>
-      <w:keepLines w:val="1"/>
-      <w:pageBreakBefore w:val="0"/>
-      <w:spacing w:after="60" w:before="0" w:lineRule="auto"/>
+      <w:keepNext/>
+      <w:keepLines/>
+      <w:spacing w:after="60"/>
     </w:pPr>
     <w:rPr>
       <w:sz w:val="52"/>
@@ -848,16 +1253,14 @@
     <w:name w:val="Subtitle"/>
     <w:basedOn w:val="Normal"/>
     <w:next w:val="Normal"/>
+    <w:uiPriority w:val="11"/>
+    <w:qFormat/>
     <w:pPr>
-      <w:keepNext w:val="1"/>
-      <w:keepLines w:val="1"/>
-      <w:pageBreakBefore w:val="0"/>
-      <w:spacing w:after="320" w:before="0" w:lineRule="auto"/>
+      <w:keepNext/>
+      <w:keepLines/>
+      <w:spacing w:after="320"/>
     </w:pPr>
     <w:rPr>
-      <w:rFonts w:ascii="Arial" w:cs="Arial" w:eastAsia="Arial" w:hAnsi="Arial"/>
-      <w:i w:val="0"/>
-      <w:iCs w:val="0"/>
       <w:color w:val="666666"/>
       <w:sz w:val="30"/>
       <w:szCs w:val="30"/>

</xml_diff>

<commit_message>
Add per-node confidence, hybrid hedges, and Excel session export.
Track answer confidence with calibration rules and host clamping, support pure-IDK skips and LLM hedge messages with template fallback, and append field values with confidence to session_fields.xlsx on tree completion.

Co-authored-by: Cursor <cursoragent@cursor.com>
</commit_message>
<xml_diff>
--- a/Tree-Structures.docx
+++ b/Tree-Structures.docx
@@ -4,20 +4,6 @@
   <w:body>
     <w:p>
       <w:r>
-        <w:t xml:space="preserve">TODO: add branches for double checking complaint filing/compliant payment dates. Also create fields to save into a </w:t>
-      </w:r>
-      <w:proofErr w:type="spellStart"/>
-      <w:r>
-        <w:t>dataframe</w:t>
-      </w:r>
-      <w:proofErr w:type="spellEnd"/>
-      <w:r>
-        <w:t xml:space="preserve"> (including percentages). Also create “unsure” branches.</w:t>
-      </w:r>
-    </w:p>
-    <w:p/>
-    <w:p>
-      <w:r>
         <w:t>Statute of Limitations</w:t>
       </w:r>
     </w:p>
@@ -422,7 +408,6 @@
         </w:numPr>
       </w:pPr>
       <w:r>
-        <w:lastRenderedPageBreak/>
         <w:t xml:space="preserve">Computation: If [threatened] or [disclosed] with [evidence], FDCPA violation is an affirmative defense. If </w:t>
       </w:r>
       <w:proofErr w:type="gramStart"/>

</xml_diff>